<commit_message>
mudança de lógica no documento e mudança em proponente e matrícula
</commit_message>
<xml_diff>
--- a/models/TESTE/tabela.docx
+++ b/models/TESTE/tabela.docx
@@ -2639,331 +2639,6 @@
       </w:pPr>
     </w:p>
     <w:p/>
-    <w:tbl>
-      <w:tblPr>
-        <w:tblStyle w:val="Tabelacomgrade"/>
-        <w:tblW w:w="0" w:type="auto"/>
-        <w:tblLook w:val="04A0" w:firstRow="1" w:lastRow="0" w:firstColumn="1" w:lastColumn="0" w:noHBand="0" w:noVBand="1"/>
-      </w:tblPr>
-      <w:tblGrid>
-        <w:gridCol w:w="1045"/>
-        <w:gridCol w:w="1218"/>
-        <w:gridCol w:w="993"/>
-        <w:gridCol w:w="982"/>
-        <w:gridCol w:w="988"/>
-        <w:gridCol w:w="1046"/>
-        <w:gridCol w:w="1046"/>
-        <w:gridCol w:w="1046"/>
-        <w:gridCol w:w="1046"/>
-        <w:gridCol w:w="1046"/>
-      </w:tblGrid>
-      <w:tr>
-        <w:tc>
-          <w:tcPr>
-            <w:tcW w:w="1045" w:type="dxa"/>
-          </w:tcPr>
-          <w:p>
-            <w:pPr>
-              <w:spacing w:after="0"/>
-            </w:pPr>
-          </w:p>
-        </w:tc>
-        <w:tc>
-          <w:tcPr>
-            <w:tcW w:w="1218" w:type="dxa"/>
-          </w:tcPr>
-          <w:p>
-            <w:pPr>
-              <w:spacing w:after="0"/>
-            </w:pPr>
-          </w:p>
-        </w:tc>
-        <w:tc>
-          <w:tcPr>
-            <w:tcW w:w="993" w:type="dxa"/>
-          </w:tcPr>
-          <w:p>
-            <w:pPr>
-              <w:spacing w:after="0"/>
-            </w:pPr>
-          </w:p>
-        </w:tc>
-        <w:tc>
-          <w:tcPr>
-            <w:tcW w:w="982" w:type="dxa"/>
-          </w:tcPr>
-          <w:p>
-            <w:pPr>
-              <w:spacing w:after="0"/>
-            </w:pPr>
-          </w:p>
-        </w:tc>
-        <w:tc>
-          <w:tcPr>
-            <w:tcW w:w="988" w:type="dxa"/>
-          </w:tcPr>
-          <w:p>
-            <w:pPr>
-              <w:spacing w:after="0"/>
-            </w:pPr>
-          </w:p>
-        </w:tc>
-        <w:tc>
-          <w:tcPr>
-            <w:tcW w:w="1046" w:type="dxa"/>
-          </w:tcPr>
-          <w:p>
-            <w:pPr>
-              <w:spacing w:after="0"/>
-            </w:pPr>
-          </w:p>
-        </w:tc>
-        <w:tc>
-          <w:tcPr>
-            <w:tcW w:w="1046" w:type="dxa"/>
-          </w:tcPr>
-          <w:p>
-            <w:pPr>
-              <w:spacing w:after="0"/>
-            </w:pPr>
-          </w:p>
-        </w:tc>
-        <w:tc>
-          <w:tcPr>
-            <w:tcW w:w="1046" w:type="dxa"/>
-          </w:tcPr>
-          <w:p>
-            <w:pPr>
-              <w:spacing w:after="0"/>
-            </w:pPr>
-          </w:p>
-        </w:tc>
-        <w:tc>
-          <w:tcPr>
-            <w:tcW w:w="1046" w:type="dxa"/>
-          </w:tcPr>
-          <w:p>
-            <w:pPr>
-              <w:spacing w:after="0"/>
-            </w:pPr>
-          </w:p>
-        </w:tc>
-        <w:tc>
-          <w:tcPr>
-            <w:tcW w:w="1046" w:type="dxa"/>
-          </w:tcPr>
-          <w:p>
-            <w:pPr>
-              <w:spacing w:after="0"/>
-            </w:pPr>
-          </w:p>
-        </w:tc>
-      </w:tr>
-      <w:tr>
-        <w:tc>
-          <w:tcPr>
-            <w:tcW w:w="1045" w:type="dxa"/>
-          </w:tcPr>
-          <w:p>
-            <w:pPr>
-              <w:spacing w:after="0"/>
-            </w:pPr>
-          </w:p>
-        </w:tc>
-        <w:tc>
-          <w:tcPr>
-            <w:tcW w:w="1218" w:type="dxa"/>
-          </w:tcPr>
-          <w:p>
-            <w:pPr>
-              <w:spacing w:after="0"/>
-            </w:pPr>
-          </w:p>
-        </w:tc>
-        <w:tc>
-          <w:tcPr>
-            <w:tcW w:w="993" w:type="dxa"/>
-          </w:tcPr>
-          <w:p>
-            <w:pPr>
-              <w:spacing w:after="0"/>
-            </w:pPr>
-          </w:p>
-        </w:tc>
-        <w:tc>
-          <w:tcPr>
-            <w:tcW w:w="982" w:type="dxa"/>
-          </w:tcPr>
-          <w:p>
-            <w:pPr>
-              <w:spacing w:after="0"/>
-            </w:pPr>
-          </w:p>
-        </w:tc>
-        <w:tc>
-          <w:tcPr>
-            <w:tcW w:w="988" w:type="dxa"/>
-          </w:tcPr>
-          <w:p>
-            <w:pPr>
-              <w:spacing w:after="0"/>
-            </w:pPr>
-          </w:p>
-        </w:tc>
-        <w:tc>
-          <w:tcPr>
-            <w:tcW w:w="1046" w:type="dxa"/>
-          </w:tcPr>
-          <w:p>
-            <w:pPr>
-              <w:spacing w:after="0"/>
-            </w:pPr>
-          </w:p>
-        </w:tc>
-        <w:tc>
-          <w:tcPr>
-            <w:tcW w:w="1046" w:type="dxa"/>
-          </w:tcPr>
-          <w:p>
-            <w:pPr>
-              <w:spacing w:after="0"/>
-            </w:pPr>
-          </w:p>
-        </w:tc>
-        <w:tc>
-          <w:tcPr>
-            <w:tcW w:w="1046" w:type="dxa"/>
-          </w:tcPr>
-          <w:p>
-            <w:pPr>
-              <w:spacing w:after="0"/>
-            </w:pPr>
-          </w:p>
-        </w:tc>
-        <w:tc>
-          <w:tcPr>
-            <w:tcW w:w="1046" w:type="dxa"/>
-          </w:tcPr>
-          <w:p>
-            <w:pPr>
-              <w:spacing w:after="0"/>
-            </w:pPr>
-          </w:p>
-        </w:tc>
-        <w:tc>
-          <w:tcPr>
-            <w:tcW w:w="1046" w:type="dxa"/>
-          </w:tcPr>
-          <w:p>
-            <w:pPr>
-              <w:spacing w:after="0"/>
-            </w:pPr>
-          </w:p>
-        </w:tc>
-      </w:tr>
-      <w:tr>
-        <w:tc>
-          <w:tcPr>
-            <w:tcW w:w="1045" w:type="dxa"/>
-          </w:tcPr>
-          <w:p>
-            <w:pPr>
-              <w:spacing w:after="0"/>
-            </w:pPr>
-          </w:p>
-        </w:tc>
-        <w:tc>
-          <w:tcPr>
-            <w:tcW w:w="1218" w:type="dxa"/>
-          </w:tcPr>
-          <w:p>
-            <w:pPr>
-              <w:spacing w:after="0"/>
-            </w:pPr>
-          </w:p>
-        </w:tc>
-        <w:tc>
-          <w:tcPr>
-            <w:tcW w:w="993" w:type="dxa"/>
-          </w:tcPr>
-          <w:p>
-            <w:pPr>
-              <w:spacing w:after="0"/>
-            </w:pPr>
-          </w:p>
-        </w:tc>
-        <w:tc>
-          <w:tcPr>
-            <w:tcW w:w="982" w:type="dxa"/>
-          </w:tcPr>
-          <w:p>
-            <w:pPr>
-              <w:spacing w:after="0"/>
-            </w:pPr>
-          </w:p>
-        </w:tc>
-        <w:tc>
-          <w:tcPr>
-            <w:tcW w:w="988" w:type="dxa"/>
-          </w:tcPr>
-          <w:p>
-            <w:pPr>
-              <w:spacing w:after="0"/>
-            </w:pPr>
-          </w:p>
-        </w:tc>
-        <w:tc>
-          <w:tcPr>
-            <w:tcW w:w="1046" w:type="dxa"/>
-          </w:tcPr>
-          <w:p>
-            <w:pPr>
-              <w:spacing w:after="0"/>
-            </w:pPr>
-          </w:p>
-        </w:tc>
-        <w:tc>
-          <w:tcPr>
-            <w:tcW w:w="1046" w:type="dxa"/>
-          </w:tcPr>
-          <w:p>
-            <w:pPr>
-              <w:spacing w:after="0"/>
-            </w:pPr>
-          </w:p>
-        </w:tc>
-        <w:tc>
-          <w:tcPr>
-            <w:tcW w:w="1046" w:type="dxa"/>
-          </w:tcPr>
-          <w:p>
-            <w:pPr>
-              <w:spacing w:after="0"/>
-            </w:pPr>
-          </w:p>
-        </w:tc>
-        <w:tc>
-          <w:tcPr>
-            <w:tcW w:w="1046" w:type="dxa"/>
-          </w:tcPr>
-          <w:p>
-            <w:pPr>
-              <w:spacing w:after="0"/>
-            </w:pPr>
-          </w:p>
-        </w:tc>
-        <w:tc>
-          <w:tcPr>
-            <w:tcW w:w="1046" w:type="dxa"/>
-          </w:tcPr>
-          <w:p>
-            <w:pPr>
-              <w:spacing w:after="0"/>
-            </w:pPr>
-          </w:p>
-        </w:tc>
-      </w:tr>
-    </w:tbl>
     <w:p>
       <w:pPr>
         <w:spacing w:after="0"/>

</xml_diff>